<commit_message>
Realizado Ejemplo de repaso  escritura con JAXB
</commit_message>
<xml_diff>
--- a/ApuntesEVA1.docx
+++ b/ApuntesEVA1.docx
@@ -1,6 +1,6 @@
 
 <file path=word/document.xml><?xml version="1.0" encoding="utf-8"?>
-<w:document xmlns:ve="http://schemas.openxmlformats.org/markup-compatibility/2006" xmlns:o="urn:schemas-microsoft-com:office:office" xmlns:r="http://schemas.openxmlformats.org/officeDocument/2006/relationships" xmlns:m="http://schemas.openxmlformats.org/officeDocument/2006/math" xmlns:v="urn:schemas-microsoft-com:vml" xmlns:wp="http://schemas.openxmlformats.org/drawingml/2006/wordprocessingDrawing" xmlns:w10="urn:schemas-microsoft-com:office:word" xmlns:w="http://schemas.openxmlformats.org/wordprocessingml/2006/main" xmlns:wne="http://schemas.microsoft.com/office/word/2006/wordml">
+<w:document xmlns:wpc="http://schemas.microsoft.com/office/word/2010/wordprocessingCanvas" xmlns:mc="http://schemas.openxmlformats.org/markup-compatibility/2006" xmlns:o="urn:schemas-microsoft-com:office:office" xmlns:r="http://schemas.openxmlformats.org/officeDocument/2006/relationships" xmlns:m="http://schemas.openxmlformats.org/officeDocument/2006/math" xmlns:v="urn:schemas-microsoft-com:vml" xmlns:wp14="http://schemas.microsoft.com/office/word/2010/wordprocessingDrawing" xmlns:wp="http://schemas.openxmlformats.org/drawingml/2006/wordprocessingDrawing" xmlns:w10="urn:schemas-microsoft-com:office:word" xmlns:w="http://schemas.openxmlformats.org/wordprocessingml/2006/main" xmlns:w14="http://schemas.microsoft.com/office/word/2010/wordml" xmlns:wpg="http://schemas.microsoft.com/office/word/2010/wordprocessingGroup" xmlns:wpi="http://schemas.microsoft.com/office/word/2010/wordprocessingInk" xmlns:wne="http://schemas.microsoft.com/office/word/2006/wordml" xmlns:wps="http://schemas.microsoft.com/office/word/2010/wordprocessingShape" mc:Ignorable="w14 wp14">
   <w:body>
     <w:sdt>
       <w:sdtPr>
@@ -26,7 +26,7 @@
           <w:tblPr>
             <w:tblW w:w="5000" w:type="pct"/>
             <w:jc w:val="center"/>
-            <w:tblLook w:val="04A0"/>
+            <w:tblLook w:val="04A0" w:firstRow="1" w:lastRow="0" w:firstColumn="1" w:lastColumn="0" w:noHBand="0" w:noVBand="1"/>
           </w:tblPr>
           <w:tblGrid>
             <w:gridCol w:w="8720"/>
@@ -97,6 +97,7 @@
                 <w:dataBinding w:prefixMappings="xmlns:ns0='http://schemas.openxmlformats.org/package/2006/metadata/core-properties' xmlns:ns1='http://purl.org/dc/elements/1.1/'" w:xpath="/ns0:coreProperties[1]/ns1:title[1]" w:storeItemID="{6C3C8BC8-F283-45AE-878A-BAB7291924A1}"/>
                 <w:text/>
               </w:sdtPr>
+              <w:sdtEndPr/>
               <w:sdtContent>
                 <w:tc>
                   <w:tcPr>
@@ -149,6 +150,7 @@
                 <w:dataBinding w:prefixMappings="xmlns:ns0='http://schemas.openxmlformats.org/package/2006/metadata/core-properties' xmlns:ns1='http://purl.org/dc/elements/1.1/'" w:xpath="/ns0:coreProperties[1]/ns1:subject[1]" w:storeItemID="{6C3C8BC8-F283-45AE-878A-BAB7291924A1}"/>
                 <w:text/>
               </w:sdtPr>
+              <w:sdtEndPr/>
               <w:sdtContent>
                 <w:tc>
                   <w:tcPr>
@@ -221,6 +223,7 @@
                 <w:dataBinding w:prefixMappings="xmlns:ns0='http://schemas.openxmlformats.org/package/2006/metadata/core-properties' xmlns:ns1='http://purl.org/dc/elements/1.1/'" w:xpath="/ns0:coreProperties[1]/ns1:creator[1]" w:storeItemID="{6C3C8BC8-F283-45AE-878A-BAB7291924A1}"/>
                 <w:text/>
               </w:sdtPr>
+              <w:sdtEndPr/>
               <w:sdtContent>
                 <w:tc>
                   <w:tcPr>
@@ -290,6 +293,7 @@
                   <w:calendar w:val="gregorian"/>
                 </w:date>
               </w:sdtPr>
+              <w:sdtEndPr/>
               <w:sdtContent>
                 <w:tc>
                   <w:tcPr>
@@ -332,7 +336,7 @@
           <w:tblPr>
             <w:tblpPr w:leftFromText="187" w:rightFromText="187" w:horzAnchor="margin" w:tblpXSpec="center" w:tblpYSpec="bottom"/>
             <w:tblW w:w="5000" w:type="pct"/>
-            <w:tblLook w:val="04A0"/>
+            <w:tblLook w:val="04A0" w:firstRow="1" w:lastRow="0" w:firstColumn="1" w:lastColumn="0" w:noHBand="0" w:noVBand="1"/>
           </w:tblPr>
           <w:tblGrid>
             <w:gridCol w:w="8720"/>
@@ -375,6 +379,7 @@
           <w:docPartUnique/>
         </w:docPartObj>
       </w:sdtPr>
+      <w:sdtEndPr/>
       <w:sdtContent>
         <w:p>
           <w:pPr>
@@ -1641,19 +1646,11 @@
         </w:rPr>
         <w:t xml:space="preserve">¿Qué es </w:t>
       </w:r>
-      <w:proofErr w:type="spellStart"/>
       <w:r>
         <w:rPr>
           <w:sz w:val="24"/>
         </w:rPr>
-        <w:t>File</w:t>
-      </w:r>
-      <w:proofErr w:type="spellEnd"/>
-      <w:r>
-        <w:rPr>
-          <w:sz w:val="24"/>
-        </w:rPr>
-        <w:t>?</w:t>
+        <w:t>File?</w:t>
       </w:r>
     </w:p>
     <w:p>
@@ -1664,14 +1661,12 @@
           <w:numId w:val="4"/>
         </w:numPr>
       </w:pPr>
-      <w:proofErr w:type="spellStart"/>
       <w:r>
         <w:rPr>
           <w:b/>
         </w:rPr>
         <w:t>File</w:t>
       </w:r>
-      <w:proofErr w:type="spellEnd"/>
       <w:r>
         <w:t>: es un</w:t>
       </w:r>
@@ -1732,15 +1727,7 @@
       </w:r>
       <w:proofErr w:type="spellEnd"/>
       <w:r>
-        <w:t xml:space="preserve"> con los nombres de los ficheros y directorios de un objeto </w:t>
-      </w:r>
-      <w:proofErr w:type="spellStart"/>
-      <w:r>
-        <w:t>File</w:t>
-      </w:r>
-      <w:proofErr w:type="spellEnd"/>
-      <w:r>
-        <w:t>.</w:t>
+        <w:t xml:space="preserve"> con los nombres de los ficheros y directorios de un objeto File.</w:t>
       </w:r>
     </w:p>
     <w:p>
@@ -2159,20 +2146,12 @@
         </w:rPr>
         <w:t>(</w:t>
       </w:r>
-      <w:proofErr w:type="spellStart"/>
       <w:proofErr w:type="gramEnd"/>
       <w:r>
         <w:rPr>
           <w:b/>
         </w:rPr>
-        <w:t>File</w:t>
-      </w:r>
-      <w:proofErr w:type="spellEnd"/>
-      <w:r>
-        <w:rPr>
-          <w:b/>
-        </w:rPr>
-        <w:t>, “</w:t>
+        <w:t>File, “</w:t>
       </w:r>
       <w:proofErr w:type="spellStart"/>
       <w:r>
@@ -2207,7 +2186,6 @@
         </w:numPr>
       </w:pPr>
       <w:proofErr w:type="spellStart"/>
-      <w:proofErr w:type="gramStart"/>
       <w:r>
         <w:rPr>
           <w:b/>
@@ -2219,14 +2197,7 @@
         <w:rPr>
           <w:b/>
         </w:rPr>
-        <w:t>(</w:t>
-      </w:r>
-      <w:proofErr w:type="gramEnd"/>
-      <w:r>
-        <w:rPr>
-          <w:b/>
-        </w:rPr>
-        <w:t xml:space="preserve">): </w:t>
+        <w:t xml:space="preserve">(): </w:t>
       </w:r>
       <w:r>
         <w:t>elimina el directorio si est</w:t>
@@ -2247,7 +2218,6 @@
         </w:numPr>
       </w:pPr>
       <w:proofErr w:type="spellStart"/>
-      <w:proofErr w:type="gramStart"/>
       <w:r>
         <w:rPr>
           <w:b/>
@@ -2259,14 +2229,7 @@
         <w:rPr>
           <w:b/>
         </w:rPr>
-        <w:t>(</w:t>
-      </w:r>
-      <w:proofErr w:type="gramEnd"/>
-      <w:r>
-        <w:rPr>
-          <w:b/>
-        </w:rPr>
-        <w:t>):</w:t>
+        <w:t>():</w:t>
       </w:r>
       <w:r>
         <w:t xml:space="preserve"> crea un fichero vacío</w:t>
@@ -2284,7 +2247,6 @@
         </w:numPr>
       </w:pPr>
       <w:proofErr w:type="spellStart"/>
-      <w:proofErr w:type="gramStart"/>
       <w:r>
         <w:rPr>
           <w:b/>
@@ -2296,14 +2258,7 @@
         <w:rPr>
           <w:b/>
         </w:rPr>
-        <w:t>(</w:t>
-      </w:r>
-      <w:proofErr w:type="gramEnd"/>
-      <w:r>
-        <w:rPr>
-          <w:b/>
-        </w:rPr>
-        <w:t>):</w:t>
+        <w:t>():</w:t>
       </w:r>
       <w:r>
         <w:t xml:space="preserve"> devuelve el nombre del directorio padre (</w:t>
@@ -2859,15 +2814,7 @@
       </w:r>
       <w:proofErr w:type="spellEnd"/>
       <w:r>
-        <w:t xml:space="preserve">: permite utilizar un espacio de almacenamiento </w:t>
-      </w:r>
-      <w:proofErr w:type="gramStart"/>
-      <w:r>
-        <w:t>intermedio(</w:t>
-      </w:r>
-      <w:proofErr w:type="gramEnd"/>
-      <w:r>
-        <w:t>buffer) en memoria.</w:t>
+        <w:t>: permite utilizar un espacio de almacenamiento intermedio(buffer) en memoria.</w:t>
       </w:r>
     </w:p>
     <w:p>
@@ -4574,7 +4521,6 @@
         <w:t xml:space="preserve"> </w:t>
       </w:r>
       <w:proofErr w:type="spellStart"/>
-      <w:proofErr w:type="gramStart"/>
       <w:r>
         <w:t>Read</w:t>
       </w:r>
@@ -4583,7 +4529,6 @@
         <w:t>(</w:t>
       </w:r>
       <w:proofErr w:type="spellStart"/>
-      <w:proofErr w:type="gramEnd"/>
       <w:r>
         <w:t>char</w:t>
       </w:r>
@@ -4633,7 +4578,6 @@
         <w:t xml:space="preserve"> </w:t>
       </w:r>
       <w:proofErr w:type="spellStart"/>
-      <w:proofErr w:type="gramStart"/>
       <w:r>
         <w:t>Read</w:t>
       </w:r>
@@ -4642,7 +4586,6 @@
         <w:t>(</w:t>
       </w:r>
       <w:proofErr w:type="spellStart"/>
-      <w:proofErr w:type="gramEnd"/>
       <w:r>
         <w:t>char</w:t>
       </w:r>
@@ -4753,17 +4696,12 @@
         <w:t xml:space="preserve"> con el método </w:t>
       </w:r>
       <w:proofErr w:type="spellStart"/>
-      <w:proofErr w:type="gramStart"/>
       <w:r>
         <w:t>close</w:t>
       </w:r>
       <w:proofErr w:type="spellEnd"/>
       <w:r>
-        <w:t>(</w:t>
-      </w:r>
-      <w:proofErr w:type="gramEnd"/>
-      <w:r>
-        <w:t>).</w:t>
+        <w:t>().</w:t>
       </w:r>
     </w:p>
     <w:p>
@@ -4874,7 +4812,6 @@
         <w:t xml:space="preserve"> </w:t>
       </w:r>
       <w:proofErr w:type="spellStart"/>
-      <w:proofErr w:type="gramStart"/>
       <w:r>
         <w:t>write</w:t>
       </w:r>
@@ -4883,7 +4820,6 @@
         <w:t>(</w:t>
       </w:r>
       <w:proofErr w:type="spellStart"/>
-      <w:proofErr w:type="gramEnd"/>
       <w:r>
         <w:t>char</w:t>
       </w:r>
@@ -5046,7 +4982,15 @@
       </w:r>
       <w:proofErr w:type="spellEnd"/>
       <w:r>
-        <w:t xml:space="preserve"> no tenia métodos para leen líneas completas pero </w:t>
+        <w:t xml:space="preserve"> no </w:t>
+      </w:r>
+      <w:proofErr w:type="spellStart"/>
+      <w:r>
+        <w:t>tenia</w:t>
+      </w:r>
+      <w:proofErr w:type="spellEnd"/>
+      <w:r>
+        <w:t xml:space="preserve"> métodos para leen líneas completas pero </w:t>
       </w:r>
       <w:proofErr w:type="spellStart"/>
       <w:r>
@@ -5397,17 +5341,12 @@
         <w:t xml:space="preserve"> </w:t>
       </w:r>
       <w:proofErr w:type="spellStart"/>
-      <w:proofErr w:type="gramStart"/>
       <w:r>
         <w:t>Read</w:t>
       </w:r>
       <w:proofErr w:type="spellEnd"/>
       <w:r>
-        <w:t>(</w:t>
-      </w:r>
-      <w:proofErr w:type="gramEnd"/>
-      <w:r>
-        <w:t>byte[] b): leer la matriz b hasta su longitud máxima y los devuelve.</w:t>
+        <w:t>(byte[] b): leer la matriz b hasta su longitud máxima y los devuelve.</w:t>
       </w:r>
     </w:p>
     <w:p>
@@ -5427,17 +5366,12 @@
         <w:t xml:space="preserve"> </w:t>
       </w:r>
       <w:proofErr w:type="spellStart"/>
-      <w:proofErr w:type="gramStart"/>
       <w:r>
         <w:t>read</w:t>
       </w:r>
       <w:proofErr w:type="spellEnd"/>
       <w:r>
-        <w:t>[</w:t>
-      </w:r>
-      <w:proofErr w:type="gramEnd"/>
-      <w:r>
-        <w:t xml:space="preserve">byte[] b, </w:t>
+        <w:t xml:space="preserve">[byte[] b, </w:t>
       </w:r>
       <w:proofErr w:type="spellStart"/>
       <w:r>
@@ -5559,17 +5493,12 @@
         <w:t xml:space="preserve"> </w:t>
       </w:r>
       <w:proofErr w:type="spellStart"/>
-      <w:proofErr w:type="gramStart"/>
       <w:r>
         <w:t>write</w:t>
       </w:r>
       <w:proofErr w:type="spellEnd"/>
       <w:r>
-        <w:t>(</w:t>
-      </w:r>
-      <w:proofErr w:type="gramEnd"/>
-      <w:r>
-        <w:t xml:space="preserve">byte [] b, </w:t>
+        <w:t xml:space="preserve">(byte [] b, </w:t>
       </w:r>
       <w:proofErr w:type="spellStart"/>
       <w:r>
@@ -6559,17 +6488,12 @@
         <w:t xml:space="preserve"> </w:t>
       </w:r>
       <w:proofErr w:type="spellStart"/>
-      <w:proofErr w:type="gramStart"/>
       <w:r>
         <w:t>writeStreamHeader</w:t>
       </w:r>
       <w:proofErr w:type="spellEnd"/>
       <w:r>
-        <w:t>(</w:t>
-      </w:r>
-      <w:proofErr w:type="gramEnd"/>
-      <w:r>
-        <w:t>): este método sirve para escribir la cabecera</w:t>
+        <w:t>(): este método sirve para escribir la cabecera</w:t>
       </w:r>
       <w:r>
         <w:t xml:space="preserve"> (es importante modificar este método creando una clase que extienda </w:t>
@@ -6748,15 +6672,7 @@
       </w:r>
       <w:proofErr w:type="spellEnd"/>
       <w:r>
-        <w:t>(</w:t>
-      </w:r>
-      <w:proofErr w:type="spellStart"/>
-      <w:r>
-        <w:t>File</w:t>
-      </w:r>
-      <w:proofErr w:type="spellEnd"/>
-      <w:r>
-        <w:t xml:space="preserve"> </w:t>
+        <w:t xml:space="preserve">(File </w:t>
       </w:r>
       <w:proofErr w:type="spellStart"/>
       <w:r>
@@ -6925,7 +6841,6 @@
         <w:t xml:space="preserve"> </w:t>
       </w:r>
       <w:proofErr w:type="spellStart"/>
-      <w:proofErr w:type="gramStart"/>
       <w:r>
         <w:t>seek</w:t>
       </w:r>
@@ -6934,7 +6849,6 @@
         <w:t>(</w:t>
       </w:r>
       <w:proofErr w:type="spellStart"/>
-      <w:proofErr w:type="gramEnd"/>
       <w:r>
         <w:t>long</w:t>
       </w:r>
@@ -6986,7 +6900,6 @@
         <w:t xml:space="preserve"> </w:t>
       </w:r>
       <w:proofErr w:type="spellStart"/>
-      <w:proofErr w:type="gramStart"/>
       <w:r>
         <w:t>skipBytes</w:t>
       </w:r>
@@ -6995,7 +6908,6 @@
         <w:t>(</w:t>
       </w:r>
       <w:proofErr w:type="spellStart"/>
-      <w:proofErr w:type="gramEnd"/>
       <w:r>
         <w:t>int</w:t>
       </w:r>
@@ -7170,18 +7082,10 @@
         </w:rPr>
       </w:pPr>
       <w:r>
-        <w:t xml:space="preserve">Protocolo </w:t>
-      </w:r>
-      <w:proofErr w:type="gramStart"/>
-      <w:r>
-        <w:t>SOAP</w:t>
-      </w:r>
-      <w:r>
-        <w:t>(</w:t>
-      </w:r>
-      <w:proofErr w:type="gramEnd"/>
-      <w:r>
-        <w:t xml:space="preserve">Simple </w:t>
+        <w:t>Protocolo SOAP</w:t>
+      </w:r>
+      <w:r>
+        <w:t xml:space="preserve">(Simple </w:t>
       </w:r>
       <w:proofErr w:type="spellStart"/>
       <w:r>
@@ -7739,13 +7643,8 @@
           <w:u w:val="single"/>
         </w:rPr>
       </w:pPr>
-      <w:proofErr w:type="spellStart"/>
-      <w:r>
-        <w:t>Text</w:t>
-      </w:r>
-      <w:proofErr w:type="spellEnd"/>
-      <w:r>
-        <w:t>: son los datos de tipo carácter de un elemento</w:t>
+      <w:r>
+        <w:t>Text: son los datos de tipo carácter de un elemento</w:t>
       </w:r>
       <w:r>
         <w:t>.</w:t>
@@ -8166,15 +8065,7 @@
       </w:r>
       <w:proofErr w:type="spellEnd"/>
       <w:r>
-        <w:t xml:space="preserve"> están dentro de </w:t>
-      </w:r>
-      <w:proofErr w:type="gramStart"/>
-      <w:r>
-        <w:t>otros ,</w:t>
-      </w:r>
-      <w:proofErr w:type="gramEnd"/>
-      <w:r>
-        <w:t xml:space="preserve"> pero si el try interno no tuviera un manejador catch, se buscaría las sentencias catch del try externo</w:t>
+        <w:t xml:space="preserve"> están dentro de otros , pero si el try interno no tuviera un manejador catch, se buscaría las sentencias catch del try externo</w:t>
       </w:r>
       <w:r>
         <w:t>.</w:t>
@@ -8241,7 +8132,7 @@
           <w:tab w:val="left" w:pos="945"/>
         </w:tabs>
       </w:pPr>
-      <w:hyperlink r:id="rId9" w:history="1">
+      <w:hyperlink r:id="rId10" w:history="1">
         <w:r>
           <w:rPr>
             <w:rStyle w:val="Hipervnculo"/>
@@ -8314,11 +8205,9 @@
           <w:tab w:val="left" w:pos="945"/>
         </w:tabs>
       </w:pPr>
-      <w:proofErr w:type="spellStart"/>
       <w:r>
         <w:t>Javax.activation-api.jar</w:t>
       </w:r>
-      <w:proofErr w:type="spellEnd"/>
     </w:p>
     <w:p>
       <w:pPr>
@@ -8330,8 +8219,9 @@
         <w:tabs>
           <w:tab w:val="left" w:pos="945"/>
         </w:tabs>
-        <w:ind w:left="2832" w:hanging="1032"/>
-      </w:pPr>
+      </w:pPr>
+      <w:bookmarkStart w:id="14" w:name="_GoBack"/>
+      <w:bookmarkEnd w:id="14"/>
       <w:r>
         <w:t>Istack-commons-runtime.jar</w:t>
       </w:r>
@@ -8918,15 +8808,7 @@
       </w:r>
       <w:proofErr w:type="spellEnd"/>
       <w:r>
-        <w:t xml:space="preserve"> </w:t>
-      </w:r>
-      <w:proofErr w:type="spellStart"/>
-      <w:r>
-        <w:t>Old</w:t>
-      </w:r>
-      <w:proofErr w:type="spellEnd"/>
-      <w:r>
-        <w:t xml:space="preserve"> Java </w:t>
+        <w:t xml:space="preserve"> Old Java </w:t>
       </w:r>
       <w:proofErr w:type="spellStart"/>
       <w:r>
@@ -8938,8 +8820,8 @@
       </w:r>
     </w:p>
     <w:sectPr>
-      <w:headerReference w:type="default" r:id="rId10"/>
-      <w:footerReference w:type="default" r:id="rId11"/>
+      <w:headerReference w:type="default" r:id="rId11"/>
+      <w:footerReference w:type="default" r:id="rId12"/>
       <w:pgSz w:w="11906" w:h="16838"/>
       <w:pgMar w:top="1417" w:right="1701" w:bottom="1417" w:left="1701" w:header="708" w:footer="708" w:gutter="0"/>
       <w:pgNumType w:start="0"/>
@@ -8952,7 +8834,7 @@
 </file>
 
 <file path=word/endnotes.xml><?xml version="1.0" encoding="utf-8"?>
-<w:endnotes xmlns:ve="http://schemas.openxmlformats.org/markup-compatibility/2006" xmlns:o="urn:schemas-microsoft-com:office:office" xmlns:r="http://schemas.openxmlformats.org/officeDocument/2006/relationships" xmlns:m="http://schemas.openxmlformats.org/officeDocument/2006/math" xmlns:v="urn:schemas-microsoft-com:vml" xmlns:wp="http://schemas.openxmlformats.org/drawingml/2006/wordprocessingDrawing" xmlns:w10="urn:schemas-microsoft-com:office:word" xmlns:w="http://schemas.openxmlformats.org/wordprocessingml/2006/main" xmlns:wne="http://schemas.microsoft.com/office/word/2006/wordml">
+<w:endnotes xmlns:wpc="http://schemas.microsoft.com/office/word/2010/wordprocessingCanvas" xmlns:mc="http://schemas.openxmlformats.org/markup-compatibility/2006" xmlns:o="urn:schemas-microsoft-com:office:office" xmlns:r="http://schemas.openxmlformats.org/officeDocument/2006/relationships" xmlns:m="http://schemas.openxmlformats.org/officeDocument/2006/math" xmlns:v="urn:schemas-microsoft-com:vml" xmlns:wp14="http://schemas.microsoft.com/office/word/2010/wordprocessingDrawing" xmlns:wp="http://schemas.openxmlformats.org/drawingml/2006/wordprocessingDrawing" xmlns:w10="urn:schemas-microsoft-com:office:word" xmlns:w="http://schemas.openxmlformats.org/wordprocessingml/2006/main" xmlns:w14="http://schemas.microsoft.com/office/word/2010/wordml" xmlns:wpg="http://schemas.microsoft.com/office/word/2010/wordprocessingGroup" xmlns:wpi="http://schemas.microsoft.com/office/word/2010/wordprocessingInk" xmlns:wne="http://schemas.microsoft.com/office/word/2006/wordml" xmlns:wps="http://schemas.microsoft.com/office/word/2010/wordprocessingShape" mc:Ignorable="w14 wp14">
   <w:endnote w:type="separator" w:id="-1">
     <w:p>
       <w:pPr>
@@ -8977,7 +8859,7 @@
 </file>
 
 <file path=word/footer1.xml><?xml version="1.0" encoding="utf-8"?>
-<w:ftr xmlns:ve="http://schemas.openxmlformats.org/markup-compatibility/2006" xmlns:o="urn:schemas-microsoft-com:office:office" xmlns:r="http://schemas.openxmlformats.org/officeDocument/2006/relationships" xmlns:m="http://schemas.openxmlformats.org/officeDocument/2006/math" xmlns:v="urn:schemas-microsoft-com:vml" xmlns:wp="http://schemas.openxmlformats.org/drawingml/2006/wordprocessingDrawing" xmlns:w10="urn:schemas-microsoft-com:office:word" xmlns:w="http://schemas.openxmlformats.org/wordprocessingml/2006/main" xmlns:wne="http://schemas.microsoft.com/office/word/2006/wordml">
+<w:ftr xmlns:wpc="http://schemas.microsoft.com/office/word/2010/wordprocessingCanvas" xmlns:mc="http://schemas.openxmlformats.org/markup-compatibility/2006" xmlns:o="urn:schemas-microsoft-com:office:office" xmlns:r="http://schemas.openxmlformats.org/officeDocument/2006/relationships" xmlns:m="http://schemas.openxmlformats.org/officeDocument/2006/math" xmlns:v="urn:schemas-microsoft-com:vml" xmlns:wp14="http://schemas.microsoft.com/office/word/2010/wordprocessingDrawing" xmlns:wp="http://schemas.openxmlformats.org/drawingml/2006/wordprocessingDrawing" xmlns:w10="urn:schemas-microsoft-com:office:word" xmlns:w="http://schemas.openxmlformats.org/wordprocessingml/2006/main" xmlns:w14="http://schemas.microsoft.com/office/word/2010/wordml" xmlns:wpg="http://schemas.microsoft.com/office/word/2010/wordprocessingGroup" xmlns:wpi="http://schemas.microsoft.com/office/word/2010/wordprocessingInk" xmlns:wne="http://schemas.microsoft.com/office/word/2006/wordml" xmlns:wps="http://schemas.microsoft.com/office/word/2010/wordprocessingShape" mc:Ignorable="w14 wp14">
   <w:sdt>
     <w:sdtPr>
       <w:id w:val="-52084826"/>
@@ -8986,6 +8868,7 @@
         <w:docPartUnique/>
       </w:docPartObj>
     </w:sdtPr>
+    <w:sdtEndPr/>
     <w:sdtContent>
       <w:sdt>
         <w:sdtPr>
@@ -8995,9 +8878,8 @@
             <w:docPartUnique/>
           </w:docPartObj>
         </w:sdtPr>
+        <w:sdtEndPr/>
         <w:sdtContent>
-          <w:bookmarkStart w:id="14" w:name="_GoBack" w:displacedByCustomXml="prev"/>
-          <w:bookmarkEnd w:id="14" w:displacedByCustomXml="prev"/>
           <w:p>
             <w:pPr>
               <w:pStyle w:val="Piedepgina"/>
@@ -9082,7 +8964,7 @@
                 <w:bCs/>
                 <w:noProof/>
               </w:rPr>
-              <w:t>14</w:t>
+              <w:t>13</w:t>
             </w:r>
             <w:r>
               <w:rPr>
@@ -9107,7 +8989,7 @@
 </file>
 
 <file path=word/footnotes.xml><?xml version="1.0" encoding="utf-8"?>
-<w:footnotes xmlns:ve="http://schemas.openxmlformats.org/markup-compatibility/2006" xmlns:o="urn:schemas-microsoft-com:office:office" xmlns:r="http://schemas.openxmlformats.org/officeDocument/2006/relationships" xmlns:m="http://schemas.openxmlformats.org/officeDocument/2006/math" xmlns:v="urn:schemas-microsoft-com:vml" xmlns:wp="http://schemas.openxmlformats.org/drawingml/2006/wordprocessingDrawing" xmlns:w10="urn:schemas-microsoft-com:office:word" xmlns:w="http://schemas.openxmlformats.org/wordprocessingml/2006/main" xmlns:wne="http://schemas.microsoft.com/office/word/2006/wordml">
+<w:footnotes xmlns:wpc="http://schemas.microsoft.com/office/word/2010/wordprocessingCanvas" xmlns:mc="http://schemas.openxmlformats.org/markup-compatibility/2006" xmlns:o="urn:schemas-microsoft-com:office:office" xmlns:r="http://schemas.openxmlformats.org/officeDocument/2006/relationships" xmlns:m="http://schemas.openxmlformats.org/officeDocument/2006/math" xmlns:v="urn:schemas-microsoft-com:vml" xmlns:wp14="http://schemas.microsoft.com/office/word/2010/wordprocessingDrawing" xmlns:wp="http://schemas.openxmlformats.org/drawingml/2006/wordprocessingDrawing" xmlns:w10="urn:schemas-microsoft-com:office:word" xmlns:w="http://schemas.openxmlformats.org/wordprocessingml/2006/main" xmlns:w14="http://schemas.microsoft.com/office/word/2010/wordml" xmlns:wpg="http://schemas.microsoft.com/office/word/2010/wordprocessingGroup" xmlns:wpi="http://schemas.microsoft.com/office/word/2010/wordprocessingInk" xmlns:wne="http://schemas.microsoft.com/office/word/2006/wordml" xmlns:wps="http://schemas.microsoft.com/office/word/2010/wordprocessingShape" mc:Ignorable="w14 wp14">
   <w:footnote w:type="separator" w:id="-1">
     <w:p>
       <w:pPr>
@@ -9132,7 +9014,7 @@
 </file>
 
 <file path=word/header1.xml><?xml version="1.0" encoding="utf-8"?>
-<w:hdr xmlns:ve="http://schemas.openxmlformats.org/markup-compatibility/2006" xmlns:o="urn:schemas-microsoft-com:office:office" xmlns:r="http://schemas.openxmlformats.org/officeDocument/2006/relationships" xmlns:m="http://schemas.openxmlformats.org/officeDocument/2006/math" xmlns:v="urn:schemas-microsoft-com:vml" xmlns:wp="http://schemas.openxmlformats.org/drawingml/2006/wordprocessingDrawing" xmlns:w10="urn:schemas-microsoft-com:office:word" xmlns:w="http://schemas.openxmlformats.org/wordprocessingml/2006/main" xmlns:wne="http://schemas.microsoft.com/office/word/2006/wordml">
+<w:hdr xmlns:wpc="http://schemas.microsoft.com/office/word/2010/wordprocessingCanvas" xmlns:mc="http://schemas.openxmlformats.org/markup-compatibility/2006" xmlns:o="urn:schemas-microsoft-com:office:office" xmlns:r="http://schemas.openxmlformats.org/officeDocument/2006/relationships" xmlns:m="http://schemas.openxmlformats.org/officeDocument/2006/math" xmlns:v="urn:schemas-microsoft-com:vml" xmlns:wp14="http://schemas.microsoft.com/office/word/2010/wordprocessingDrawing" xmlns:wp="http://schemas.openxmlformats.org/drawingml/2006/wordprocessingDrawing" xmlns:w10="urn:schemas-microsoft-com:office:word" xmlns:w="http://schemas.openxmlformats.org/wordprocessingml/2006/main" xmlns:w14="http://schemas.microsoft.com/office/word/2010/wordml" xmlns:wpg="http://schemas.microsoft.com/office/word/2010/wordprocessingGroup" xmlns:wpi="http://schemas.microsoft.com/office/word/2010/wordprocessingInk" xmlns:wne="http://schemas.microsoft.com/office/word/2006/wordml" xmlns:wps="http://schemas.microsoft.com/office/word/2010/wordprocessingShape" mc:Ignorable="w14 wp14">
   <w:p>
     <w:pPr>
       <w:pStyle w:val="Encabezado"/>
@@ -9162,7 +9044,7 @@
 </file>
 
 <file path=word/numbering.xml><?xml version="1.0" encoding="utf-8"?>
-<w:numbering xmlns:ve="http://schemas.openxmlformats.org/markup-compatibility/2006" xmlns:o="urn:schemas-microsoft-com:office:office" xmlns:r="http://schemas.openxmlformats.org/officeDocument/2006/relationships" xmlns:m="http://schemas.openxmlformats.org/officeDocument/2006/math" xmlns:v="urn:schemas-microsoft-com:vml" xmlns:wp="http://schemas.openxmlformats.org/drawingml/2006/wordprocessingDrawing" xmlns:w10="urn:schemas-microsoft-com:office:word" xmlns:w="http://schemas.openxmlformats.org/wordprocessingml/2006/main" xmlns:wne="http://schemas.microsoft.com/office/word/2006/wordml">
+<w:numbering xmlns:wpc="http://schemas.microsoft.com/office/word/2010/wordprocessingCanvas" xmlns:mc="http://schemas.openxmlformats.org/markup-compatibility/2006" xmlns:o="urn:schemas-microsoft-com:office:office" xmlns:r="http://schemas.openxmlformats.org/officeDocument/2006/relationships" xmlns:m="http://schemas.openxmlformats.org/officeDocument/2006/math" xmlns:v="urn:schemas-microsoft-com:vml" xmlns:wp14="http://schemas.microsoft.com/office/word/2010/wordprocessingDrawing" xmlns:wp="http://schemas.openxmlformats.org/drawingml/2006/wordprocessingDrawing" xmlns:w10="urn:schemas-microsoft-com:office:word" xmlns:w="http://schemas.openxmlformats.org/wordprocessingml/2006/main" xmlns:w14="http://schemas.microsoft.com/office/word/2010/wordml" xmlns:wpg="http://schemas.microsoft.com/office/word/2010/wordprocessingGroup" xmlns:wpi="http://schemas.microsoft.com/office/word/2010/wordprocessingInk" xmlns:wne="http://schemas.microsoft.com/office/word/2006/wordml" xmlns:wps="http://schemas.microsoft.com/office/word/2010/wordprocessingShape" mc:Ignorable="w14 wp14">
   <w:abstractNum w:abstractNumId="0">
     <w:nsid w:val="000C05F2"/>
     <w:multiLevelType w:val="hybridMultilevel"/>
@@ -11231,7 +11113,7 @@
 </file>
 
 <file path=word/styles.xml><?xml version="1.0" encoding="utf-8"?>
-<w:styles xmlns:r="http://schemas.openxmlformats.org/officeDocument/2006/relationships" xmlns:w="http://schemas.openxmlformats.org/wordprocessingml/2006/main">
+<w:styles xmlns:mc="http://schemas.openxmlformats.org/markup-compatibility/2006" xmlns:r="http://schemas.openxmlformats.org/officeDocument/2006/relationships" xmlns:w="http://schemas.openxmlformats.org/wordprocessingml/2006/main" xmlns:w14="http://schemas.microsoft.com/office/word/2010/wordml" mc:Ignorable="w14">
   <w:docDefaults>
     <w:rPrDefault>
       <w:rPr>
@@ -11425,7 +11307,6 @@
     <w:uiPriority w:val="99"/>
     <w:semiHidden/>
     <w:unhideWhenUsed/>
-    <w:qFormat/>
     <w:tblPr>
       <w:tblInd w:w="0" w:type="dxa"/>
       <w:tblCellMar>
@@ -12261,7 +12142,7 @@
 </file>
 
 <file path=customXml/itemProps2.xml><?xml version="1.0" encoding="utf-8"?>
-<ds:datastoreItem xmlns:ds="http://schemas.openxmlformats.org/officeDocument/2006/customXml" ds:itemID="{4AD0304A-180C-4DAE-A80E-227DF7FFA05E}">
+<ds:datastoreItem xmlns:ds="http://schemas.openxmlformats.org/officeDocument/2006/customXml" ds:itemID="{FA171998-0CA9-45B5-8B30-7C93378AFABF}">
   <ds:schemaRefs>
     <ds:schemaRef ds:uri="http://schemas.openxmlformats.org/officeDocument/2006/bibliography"/>
   </ds:schemaRefs>

</xml_diff>